<commit_message>
docs: alinha ODS aos tres do semestre (8, 11 e 16)
</commit_message>
<xml_diff>
--- a/docs/PA4_Etapa1_Proposta.docx
+++ b/docs/PA4_Etapa1_Proposta.docx
@@ -539,7 +539,7 @@
           <w:sz w:val="24"/>
           <w:szCs w:val="24"/>
         </w:rPr>
-        <w:t xml:space="preserve">Desde então, a MMGD tornou-se o segmento de maior expansão da matriz elétrica nacional, com forte predomínio da fonte solar fotovoltaica, o que a conecta diretamente a temas de infraestrutura energética, transição para fontes limpas, desenvolvimento econômico regional e sustentabilidade urbana. Nesse sentido, o tema é aderente aos Objetivos de Desenvolvimento Sustentável adotados no semestre, em especial ao ODS 8 – trabalho decente e crescimento econômico, pela cadeia produtiva e pelos investimentos mobilizados pelo setor solar, e ao ODS 11 – cidades e comunidades sustentáveis, pela descentralização da geração e pela redução da pressão sobre a infraestrutura de transmissão (ONU, 2026). De forma transversal, o projeto também dialoga com o ODS 7, relativo a energia limpa e acessível.</w:t>
+        <w:t xml:space="preserve">Desde então, a MMGD tornou-se o segmento de maior expansão da matriz elétrica nacional, com forte predomínio da fonte solar fotovoltaica, o que a conecta diretamente a temas de infraestrutura energética, transição para fontes limpas, desenvolvimento econômico regional e sustentabilidade urbana. Nesse sentido, o tema é aderente aos três Objetivos de Desenvolvimento Sustentável adotados no semestre. Ao ODS 8 – trabalho decente e crescimento econômico, pela cadeia produtiva e pelos investimentos mobilizados pelo setor solar. Ao ODS 11 – cidades e comunidades sustentáveis, pela descentralização da geração e pela redução da pressão sobre a infraestrutura de transmissão. E ao ODS 16 – paz, justiça e instituições eficazes, especificamente por suas metas 16.6, que trata do desenvolvimento de instituições eficazes, responsáveis e transparentes, e 16.10, relativa ao acesso público à informação: o projeto apoia-se integralmente em dados abertos publicados pelo regulador e converte esse acervo em evidência sobre os efeitos da Lei nº 14.300/2022, ampliando a capacidade de escrutínio público sobre uma política setorial (ONU, 2026).</w:t>
       </w:r>
     </w:p>
     <w:p>
@@ -3173,7 +3173,7 @@
                 <w:sz w:val="20"/>
                 <w:szCs w:val="20"/>
               </w:rPr>
-              <w:t xml:space="preserve">Relaciona-se ao ODS 8 e ao ODS 11, definidos para o semestre, e de forma transversal ao ODS 7.</w:t>
+              <w:t xml:space="preserve">Relaciona-se aos ODS 8, 11 e 16, definidos para o semestre; o ODS 16 pelas metas 16.6 e 16.10, via uso de dados abertos e transparência regulatória.</w:t>
             </w:r>
           </w:p>
         </w:tc>

</xml_diff>